<commit_message>
docs: regenerate slideshow video and update the recording guide
</commit_message>
<xml_diff>
--- a/presentation/ParaBank_Video_Recording_Guide.docx
+++ b/presentation/ParaBank_Video_Recording_Guide.docx
@@ -211,7 +211,7 @@
                 <w:sz w:val="19"/>
                 <w:szCs w:val="19"/>
               </w:rPr>
-              <w:t xml:space="preserve">A 6-8 minute narrated demo video (.mp4)</w:t>
+              <w:t xml:space="preserve">A 10-12 minute narrated demo video (.mp4)</w:t>
             </w:r>
           </w:p>
         </w:tc>
@@ -455,7 +455,7 @@
         <w:rPr>
           <w:rFonts w:ascii="Arial" w:cs="Arial" w:eastAsia="Arial" w:hAnsi="Arial"/>
         </w:rPr>
-        <w:t xml:space="preserve">A short narrated video - 6 to 8 minutes - that walks through this ParaBank automation assessment: the approach, the test coverage, a live demo of the suite running, and the results. The video is one of the assessment deliverables (proof of execution and explanation).</w:t>
+        <w:t xml:space="preserve">A narrated video - 10 to 12 minutes - that walks through this ParaBank automation assessment: the approach, the framework, the test coverage, a live demo of the suite running, and the results. The video is one of the assessment deliverables (proof of execution and explanation).</w:t>
       </w:r>
     </w:p>
     <w:p>
@@ -627,7 +627,7 @@
                 <w:sz w:val="19"/>
                 <w:szCs w:val="19"/>
               </w:rPr>
-              <w:t xml:space="preserve">The 11-slide deck. Has narration in each slide’s Notes panel and built-in auto-advance timings.</w:t>
+              <w:t xml:space="preserve">The 17-slide deck. Has narration in each slide’s Notes panel and built-in auto-advance timings.</w:t>
             </w:r>
           </w:p>
         </w:tc>
@@ -769,7 +769,7 @@
                 <w:sz w:val="19"/>
                 <w:szCs w:val="19"/>
               </w:rPr>
-              <w:t xml:space="preserve">A silent video of the slides (6:15). Optional - use as a visual base or an on-screen cue.</w:t>
+              <w:t xml:space="preserve">A silent video of the slides (about 10 minutes). Optional - use as a visual base or an on-screen cue.</w:t>
             </w:r>
           </w:p>
         </w:tc>
@@ -1490,7 +1490,7 @@
           <w:sz w:val="21"/>
           <w:szCs w:val="21"/>
         </w:rPr>
-        <w:t xml:space="preserve">When you reach Slide 7 (Live Demo), pause the recording and record the demo separately (see section 5) - or present the demo live if you are screen-sharing.</w:t>
+        <w:t xml:space="preserve">When you reach Slide 12 (Live Demo), pause the recording and record the demo separately (see section 5) - or present the demo live if you are screen-sharing.</w:t>
       </w:r>
     </w:p>
     <w:p>
@@ -1732,7 +1732,7 @@
         <w:rPr>
           <w:rFonts w:ascii="Arial" w:cs="Arial" w:eastAsia="Arial" w:hAnsi="Arial"/>
         </w:rPr>
-        <w:t xml:space="preserve">5. Record the live demo (Slide 7)</w:t>
+        <w:t xml:space="preserve">5. Record the live demo (Slide 12)</w:t>
       </w:r>
     </w:p>
     <w:p>
@@ -2129,7 +2129,7 @@
           <w:sz w:val="21"/>
           <w:szCs w:val="21"/>
         </w:rPr>
-        <w:t xml:space="preserve">Arrange them in order: slides 1-6, then the demo clip, then slides 8-11.</w:t>
+        <w:t xml:space="preserve">Arrange them in order: slides 1-11, then the demo clip, then slides 13-17.</w:t>
       </w:r>
     </w:p>
     <w:p>
@@ -2212,7 +2212,7 @@
           <w:sz w:val="21"/>
           <w:szCs w:val="21"/>
         </w:rPr>
-        <w:t xml:space="preserve">Resolution 1080p; the finished video is between 6 and 8 minutes.</w:t>
+        <w:t xml:space="preserve">Resolution 1080p; the finished video is between 10 and 12 minutes.</w:t>
       </w:r>
     </w:p>
     <w:p>
@@ -2306,7 +2306,7 @@
         <w:rPr>
           <w:rFonts w:ascii="Arial" w:cs="Arial" w:eastAsia="Arial" w:hAnsi="Arial"/>
         </w:rPr>
-        <w:t xml:space="preserve">The script targets about 7 minutes 30 seconds. Use this as a pacing guide while recording:</w:t>
+        <w:t xml:space="preserve">The script targets about 12 minutes. Use this as a pacing guide while recording:</w:t>
       </w:r>
     </w:p>
     <w:tbl>
@@ -2322,8 +2322,8 @@
         </w:tblBorders>
       </w:tblPr>
       <w:tblGrid>
-        <w:gridCol w:w="4600"/>
-        <w:gridCol w:w="1860"/>
+        <w:gridCol w:w="5000"/>
+        <w:gridCol w:w="1460"/>
         <w:gridCol w:w="2900"/>
       </w:tblGrid>
       <w:tr>
@@ -2332,7 +2332,7 @@
         </w:trPr>
         <w:tc>
           <w:tcPr>
-            <w:tcW w:type="dxa" w:w="4600"/>
+            <w:tcW w:type="dxa" w:w="5000"/>
             <w:tcBorders>
               <w:top w:val="single" w:color="BFBFBF" w:sz="1"/>
               <w:left w:val="single" w:color="BFBFBF" w:sz="1"/>
@@ -2368,7 +2368,7 @@
         </w:tc>
         <w:tc>
           <w:tcPr>
-            <w:tcW w:type="dxa" w:w="1860"/>
+            <w:tcW w:type="dxa" w:w="1460"/>
             <w:tcBorders>
               <w:top w:val="single" w:color="BFBFBF" w:sz="1"/>
               <w:left w:val="single" w:color="BFBFBF" w:sz="1"/>
@@ -2442,7 +2442,7 @@
       <w:tr>
         <w:tc>
           <w:tcPr>
-            <w:tcW w:type="dxa" w:w="4600"/>
+            <w:tcW w:type="dxa" w:w="5000"/>
             <w:tcBorders>
               <w:top w:val="single" w:color="BFBFBF" w:sz="1"/>
               <w:left w:val="single" w:color="BFBFBF" w:sz="1"/>
@@ -2470,13 +2470,13 @@
                 <w:sz w:val="19"/>
                 <w:szCs w:val="19"/>
               </w:rPr>
-              <w:t xml:space="preserve">Intro, assignment, approach, architecture</w:t>
-            </w:r>
-          </w:p>
-        </w:tc>
-        <w:tc>
-          <w:tcPr>
-            <w:tcW w:type="dxa" w:w="1860"/>
+              <w:t xml:space="preserve">Intro, assignment, application, approach, architecture</w:t>
+            </w:r>
+          </w:p>
+        </w:tc>
+        <w:tc>
+          <w:tcPr>
+            <w:tcW w:type="dxa" w:w="1460"/>
             <w:tcBorders>
               <w:top w:val="single" w:color="BFBFBF" w:sz="1"/>
               <w:left w:val="single" w:color="BFBFBF" w:sz="1"/>
@@ -2504,7 +2504,7 @@
                 <w:sz w:val="19"/>
                 <w:szCs w:val="19"/>
               </w:rPr>
-              <w:t xml:space="preserve">1 - 4</w:t>
+              <w:t xml:space="preserve">1 - 5</w:t>
             </w:r>
           </w:p>
         </w:tc>
@@ -2538,7 +2538,7 @@
                 <w:sz w:val="19"/>
                 <w:szCs w:val="19"/>
               </w:rPr>
-              <w:t xml:space="preserve">~2:20</w:t>
+              <w:t xml:space="preserve">~2:48</w:t>
             </w:r>
           </w:p>
         </w:tc>
@@ -2546,7 +2546,7 @@
       <w:tr>
         <w:tc>
           <w:tcPr>
-            <w:tcW w:type="dxa" w:w="4600"/>
+            <w:tcW w:type="dxa" w:w="5000"/>
             <w:tcBorders>
               <w:top w:val="single" w:color="BFBFBF" w:sz="1"/>
               <w:left w:val="single" w:color="BFBFBF" w:sz="1"/>
@@ -2575,13 +2575,13 @@
                 <w:sz w:val="19"/>
                 <w:szCs w:val="19"/>
               </w:rPr>
-              <w:t xml:space="preserve">Coverage and deep testing</w:t>
-            </w:r>
-          </w:p>
-        </w:tc>
-        <w:tc>
-          <w:tcPr>
-            <w:tcW w:type="dxa" w:w="1860"/>
+              <w:t xml:space="preserve">BDD, Page Object Model &amp; coverage</w:t>
+            </w:r>
+          </w:p>
+        </w:tc>
+        <w:tc>
+          <w:tcPr>
+            <w:tcW w:type="dxa" w:w="1460"/>
             <w:tcBorders>
               <w:top w:val="single" w:color="BFBFBF" w:sz="1"/>
               <w:left w:val="single" w:color="BFBFBF" w:sz="1"/>
@@ -2610,7 +2610,7 @@
                 <w:sz w:val="19"/>
                 <w:szCs w:val="19"/>
               </w:rPr>
-              <w:t xml:space="preserve">5 - 6</w:t>
+              <w:t xml:space="preserve">6 - 8</w:t>
             </w:r>
           </w:p>
         </w:tc>
@@ -2645,7 +2645,7 @@
                 <w:sz w:val="19"/>
                 <w:szCs w:val="19"/>
               </w:rPr>
-              <w:t xml:space="preserve">~1:20</w:t>
+              <w:t xml:space="preserve">~1:48</w:t>
             </w:r>
           </w:p>
         </w:tc>
@@ -2653,7 +2653,7 @@
       <w:tr>
         <w:tc>
           <w:tcPr>
-            <w:tcW w:type="dxa" w:w="4600"/>
+            <w:tcW w:type="dxa" w:w="5000"/>
             <w:tcBorders>
               <w:top w:val="single" w:color="BFBFBF" w:sz="1"/>
               <w:left w:val="single" w:color="BFBFBF" w:sz="1"/>
@@ -2681,13 +2681,13 @@
                 <w:sz w:val="19"/>
                 <w:szCs w:val="19"/>
               </w:rPr>
-              <w:t xml:space="preserve">Live demo</w:t>
-            </w:r>
-          </w:p>
-        </w:tc>
-        <w:tc>
-          <w:tcPr>
-            <w:tcW w:type="dxa" w:w="1860"/>
+              <w:t xml:space="preserve">Deep testing - boundary, security, access &amp; performance</w:t>
+            </w:r>
+          </w:p>
+        </w:tc>
+        <w:tc>
+          <w:tcPr>
+            <w:tcW w:type="dxa" w:w="1460"/>
             <w:tcBorders>
               <w:top w:val="single" w:color="BFBFBF" w:sz="1"/>
               <w:left w:val="single" w:color="BFBFBF" w:sz="1"/>
@@ -2715,7 +2715,7 @@
                 <w:sz w:val="19"/>
                 <w:szCs w:val="19"/>
               </w:rPr>
-              <w:t xml:space="preserve">7</w:t>
+              <w:t xml:space="preserve">9 - 11</w:t>
             </w:r>
           </w:p>
         </w:tc>
@@ -2749,7 +2749,7 @@
                 <w:sz w:val="19"/>
                 <w:szCs w:val="19"/>
               </w:rPr>
-              <w:t xml:space="preserve">~1:45</w:t>
+              <w:t xml:space="preserve">~2:07</w:t>
             </w:r>
           </w:p>
         </w:tc>
@@ -2757,7 +2757,7 @@
       <w:tr>
         <w:tc>
           <w:tcPr>
-            <w:tcW w:type="dxa" w:w="4600"/>
+            <w:tcW w:type="dxa" w:w="5000"/>
             <w:tcBorders>
               <w:top w:val="single" w:color="BFBFBF" w:sz="1"/>
               <w:left w:val="single" w:color="BFBFBF" w:sz="1"/>
@@ -2786,13 +2786,13 @@
                 <w:sz w:val="19"/>
                 <w:szCs w:val="19"/>
               </w:rPr>
-              <w:t xml:space="preserve">Results, security finding, deliverables, closing</w:t>
-            </w:r>
-          </w:p>
-        </w:tc>
-        <w:tc>
-          <w:tcPr>
-            <w:tcW w:type="dxa" w:w="1860"/>
+              <w:t xml:space="preserve">Live demo</w:t>
+            </w:r>
+          </w:p>
+        </w:tc>
+        <w:tc>
+          <w:tcPr>
+            <w:tcW w:type="dxa" w:w="1460"/>
             <w:tcBorders>
               <w:top w:val="single" w:color="BFBFBF" w:sz="1"/>
               <w:left w:val="single" w:color="BFBFBF" w:sz="1"/>
@@ -2821,7 +2821,7 @@
                 <w:sz w:val="19"/>
                 <w:szCs w:val="19"/>
               </w:rPr>
-              <w:t xml:space="preserve">8 - 11</w:t>
+              <w:t xml:space="preserve">12</w:t>
             </w:r>
           </w:p>
         </w:tc>
@@ -2856,7 +2856,111 @@
                 <w:sz w:val="19"/>
                 <w:szCs w:val="19"/>
               </w:rPr>
-              <w:t xml:space="preserve">~2:05</w:t>
+              <w:t xml:space="preserve">~2:30</w:t>
+            </w:r>
+          </w:p>
+        </w:tc>
+      </w:tr>
+      <w:tr>
+        <w:tc>
+          <w:tcPr>
+            <w:tcW w:type="dxa" w:w="5000"/>
+            <w:tcBorders>
+              <w:top w:val="single" w:color="BFBFBF" w:sz="1"/>
+              <w:left w:val="single" w:color="BFBFBF" w:sz="1"/>
+              <w:bottom w:val="single" w:color="BFBFBF" w:sz="1"/>
+              <w:right w:val="single" w:color="BFBFBF" w:sz="1"/>
+            </w:tcBorders>
+            <w:tcMar>
+              <w:top w:type="dxa" w:w="60"/>
+              <w:left w:type="dxa" w:w="110"/>
+              <w:bottom w:type="dxa" w:w="60"/>
+              <w:right w:type="dxa" w:w="110"/>
+            </w:tcMar>
+            <w:vAlign w:val="center"/>
+          </w:tcPr>
+          <w:p>
+            <w:pPr>
+              <w:spacing w:after="0"/>
+              <w:jc w:val="left"/>
+            </w:pPr>
+            <w:r>
+              <w:rPr>
+                <w:rFonts w:ascii="Arial" w:cs="Arial" w:eastAsia="Arial" w:hAnsi="Arial"/>
+                <w:b/>
+                <w:bCs/>
+                <w:sz w:val="19"/>
+                <w:szCs w:val="19"/>
+              </w:rPr>
+              <w:t xml:space="preserve">Results, reporting, security finding, deliverables, closing</w:t>
+            </w:r>
+          </w:p>
+        </w:tc>
+        <w:tc>
+          <w:tcPr>
+            <w:tcW w:type="dxa" w:w="1460"/>
+            <w:tcBorders>
+              <w:top w:val="single" w:color="BFBFBF" w:sz="1"/>
+              <w:left w:val="single" w:color="BFBFBF" w:sz="1"/>
+              <w:bottom w:val="single" w:color="BFBFBF" w:sz="1"/>
+              <w:right w:val="single" w:color="BFBFBF" w:sz="1"/>
+            </w:tcBorders>
+            <w:tcMar>
+              <w:top w:type="dxa" w:w="60"/>
+              <w:left w:type="dxa" w:w="110"/>
+              <w:bottom w:type="dxa" w:w="60"/>
+              <w:right w:type="dxa" w:w="110"/>
+            </w:tcMar>
+            <w:vAlign w:val="center"/>
+          </w:tcPr>
+          <w:p>
+            <w:pPr>
+              <w:spacing w:after="0"/>
+              <w:jc w:val="left"/>
+            </w:pPr>
+            <w:r>
+              <w:rPr>
+                <w:rFonts w:ascii="Arial" w:cs="Arial" w:eastAsia="Arial" w:hAnsi="Arial"/>
+                <w:b w:val="false"/>
+                <w:bCs w:val="false"/>
+                <w:sz w:val="19"/>
+                <w:szCs w:val="19"/>
+              </w:rPr>
+              <w:t xml:space="preserve">13 - 17</w:t>
+            </w:r>
+          </w:p>
+        </w:tc>
+        <w:tc>
+          <w:tcPr>
+            <w:tcW w:type="dxa" w:w="2900"/>
+            <w:tcBorders>
+              <w:top w:val="single" w:color="BFBFBF" w:sz="1"/>
+              <w:left w:val="single" w:color="BFBFBF" w:sz="1"/>
+              <w:bottom w:val="single" w:color="BFBFBF" w:sz="1"/>
+              <w:right w:val="single" w:color="BFBFBF" w:sz="1"/>
+            </w:tcBorders>
+            <w:tcMar>
+              <w:top w:type="dxa" w:w="60"/>
+              <w:left w:type="dxa" w:w="110"/>
+              <w:bottom w:type="dxa" w:w="60"/>
+              <w:right w:type="dxa" w:w="110"/>
+            </w:tcMar>
+            <w:vAlign w:val="center"/>
+          </w:tcPr>
+          <w:p>
+            <w:pPr>
+              <w:spacing w:after="0"/>
+              <w:jc w:val="left"/>
+            </w:pPr>
+            <w:r>
+              <w:rPr>
+                <w:rFonts w:ascii="Arial" w:cs="Arial" w:eastAsia="Arial" w:hAnsi="Arial"/>
+                <w:b w:val="false"/>
+                <w:bCs w:val="false"/>
+                <w:sz w:val="19"/>
+                <w:szCs w:val="19"/>
+              </w:rPr>
+              <w:t xml:space="preserve">~2:43</w:t>
             </w:r>
           </w:p>
         </w:tc>

</xml_diff>